<commit_message>
docs(test #4): align accredited-test target to 85% and fill the item table
The accreditation item for #4 specifies 예상 결과 ≥ 85% precision, but the
procedure doc, eval tool, and result JSON all carried the earlier self-set
≥ 95% bar. Reconcile everything to the accreditation number:

- rebuild the .docx as the accreditation submission table (시험항목명/목적/
  기준/전제조건/시험도구/시험절차/예상결과/기타) with the three previously
  blank rows filled from the procedure doc;
- pass threshold 95 -> 85 in eval_affected_precision.py and the recorded
  results/affected_precision.json.

The measured precision (held-out fix-commit patch pairs, n=1200: TP 449 /
FP 3 = 99.34%) is unchanged and clears 85% with margin.

Co-Authored-By: Claude Opus 4.8 <noreply@anthropic.com>
</commit_message>
<xml_diff>
--- a/docs/시험절차서_시험항목4_VEX정밀도.docx
+++ b/docs/시험절차서_시험항목4_VEX정밀도.docx
@@ -2,100 +2,36 @@
 <file path=word/document.xml><?xml version="1.0" encoding="utf-8"?>
 <w:document xmlns:wpc="http://schemas.microsoft.com/office/word/2010/wordprocessingCanvas" xmlns:mo="http://schemas.microsoft.com/office/mac/office/2008/main" xmlns:mc="http://schemas.openxmlformats.org/markup-compatibility/2006" xmlns:mv="urn:schemas-microsoft-com:mac:vml" xmlns:o="urn:schemas-microsoft-com:office:office" xmlns:r="http://schemas.openxmlformats.org/officeDocument/2006/relationships" xmlns:m="http://schemas.openxmlformats.org/officeDocument/2006/math" xmlns:v="urn:schemas-microsoft-com:vml" xmlns:wp14="http://schemas.microsoft.com/office/word/2010/wordprocessingDrawing" xmlns:wp="http://schemas.openxmlformats.org/drawingml/2006/wordprocessingDrawing" xmlns:w10="urn:schemas-microsoft-com:office:word" xmlns:w="http://schemas.openxmlformats.org/wordprocessingml/2006/main" xmlns:w14="http://schemas.microsoft.com/office/word/2010/wordml" xmlns:wpg="http://schemas.microsoft.com/office/word/2010/wordprocessingGroup" xmlns:wpi="http://schemas.microsoft.com/office/word/2010/wordprocessingInk" xmlns:wne="http://schemas.microsoft.com/office/word/2006/wordml" xmlns:wps="http://schemas.microsoft.com/office/word/2010/wordprocessingShape" mc:Ignorable="w14 wp14">
   <w:body>
-    <w:p>
-      <w:pPr>
-        <w:spacing w:before="0" w:after="20" w:line="240" w:lineRule="auto"/>
-        <w:jc w:val="center"/>
-      </w:pPr>
-      <w:r>
-        <w:rPr>
-          <w:rFonts w:ascii="Malgun Gothic" w:hAnsi="Malgun Gothic" w:eastAsia="Malgun Gothic" w:cs="Malgun Gothic"/>
-          <w:b/>
-          <w:color w:val="1F4E79"/>
-          <w:sz w:val="28"/>
-        </w:rPr>
-        <w:t>시험절차서 — 시험항목 #4: VEX 기반 식별된 취약점 영향 판단 정밀도</w:t>
-      </w:r>
-    </w:p>
-    <w:p>
-      <w:pPr>
-        <w:spacing w:before="0" w:after="60" w:line="240" w:lineRule="auto"/>
-        <w:jc w:val="center"/>
-      </w:pPr>
-      <w:r>
-        <w:rPr>
-          <w:rFonts w:ascii="Malgun Gothic" w:hAnsi="Malgun Gothic" w:eastAsia="Malgun Gothic" w:cs="Malgun Gothic"/>
-          <w:color w:val="505050"/>
-          <w:sz w:val="17"/>
-        </w:rPr>
-        <w:t>대상: ICS-VEX(ICS-VEXForge) · 성능지표 정밀도(Precision) = TP/(TP+FP)×100 · 합격기준 ≥ 95%</w:t>
-      </w:r>
-    </w:p>
-    <w:p>
-      <w:pPr>
-        <w:spacing w:before="80" w:after="40" w:line="240" w:lineRule="auto"/>
-      </w:pPr>
-      <w:r>
-        <w:rPr>
-          <w:rFonts w:ascii="Malgun Gothic" w:hAnsi="Malgun Gothic" w:eastAsia="Malgun Gothic" w:cs="Malgun Gothic"/>
-          <w:b/>
-          <w:color w:val="1F4E79"/>
-          <w:sz w:val="21"/>
-        </w:rPr>
-        <w:t>1. 시험 도구</w:t>
-      </w:r>
-    </w:p>
     <w:tbl>
       <w:tblPr>
         <w:tblStyle w:val="TableGrid"/>
         <w:tblW w:type="auto" w:w="0"/>
         <w:jc w:val="center"/>
+        <w:tblLayout w:type="fixed"/>
         <w:tblLook w:firstColumn="1" w:firstRow="1" w:lastColumn="0" w:lastRow="0" w:noHBand="0" w:noVBand="1" w:val="04A0"/>
       </w:tblPr>
       <w:tblGrid>
-        <w:gridCol w:w="5100"/>
-        <w:gridCol w:w="5100"/>
+        <w:gridCol w:w="5020"/>
+        <w:gridCol w:w="5020"/>
       </w:tblGrid>
       <w:tr>
         <w:tc>
           <w:tcPr>
-            <w:tcW w:type="dxa" w:w="2608"/>
-            <w:shd w:val="clear" w:color="auto" w:fill="1F4E79"/>
+            <w:tcW w:type="dxa" w:w="8100"/>
+            <w:gridSpan w:val="2"/>
+            <w:shd w:val="clear" w:color="auto" w:fill="B4C6E7"/>
           </w:tcPr>
           <w:p>
             <w:pPr>
-              <w:spacing w:before="0" w:after="40" w:line="240" w:lineRule="auto"/>
+              <w:jc w:val="center"/>
             </w:pPr>
-            <w:r/>
             <w:r>
               <w:rPr>
-                <w:rFonts w:ascii="Malgun Gothic" w:hAnsi="Malgun Gothic" w:eastAsia="Malgun Gothic" w:cs="Malgun Gothic"/>
+                <w:rFonts w:ascii="맑은 고딕" w:hAnsi="맑은 고딕" w:eastAsia="맑은 고딕" w:cs="맑은 고딕"/>
                 <w:b/>
-                <w:color w:val="FFFFFF"/>
-                <w:sz w:val="17"/>
+                <w:sz w:val="26"/>
               </w:rPr>
-              <w:t>도구</w:t>
-            </w:r>
-          </w:p>
-        </w:tc>
-        <w:tc>
-          <w:tcPr>
-            <w:tcW w:type="dxa" w:w="7030"/>
-            <w:shd w:val="clear" w:color="auto" w:fill="1F4E79"/>
-          </w:tcPr>
-          <w:p>
-            <w:pPr>
-              <w:spacing w:before="0" w:after="40" w:line="240" w:lineRule="auto"/>
-            </w:pPr>
-            <w:r/>
-            <w:r>
-              <w:rPr>
-                <w:rFonts w:ascii="Malgun Gothic" w:hAnsi="Malgun Gothic" w:eastAsia="Malgun Gothic" w:cs="Malgun Gothic"/>
-                <w:b/>
-                <w:color w:val="FFFFFF"/>
-                <w:sz w:val="17"/>
-              </w:rPr>
-              <w:t>역할</w:t>
+              <w:t>시험항목 #4</w:t>
             </w:r>
           </w:p>
         </w:tc>
@@ -103,39 +39,41 @@
       <w:tr>
         <w:tc>
           <w:tcPr>
-            <w:tcW w:type="dxa" w:w="2608"/>
+            <w:tcW w:type="dxa" w:w="1900"/>
+            <w:vAlign w:val="center"/>
+            <w:shd w:val="clear" w:color="auto" w:fill="D9E2F3"/>
           </w:tcPr>
           <w:p>
             <w:pPr>
-              <w:spacing w:before="0" w:after="40" w:line="240" w:lineRule="auto"/>
+              <w:spacing w:after="40" w:before="0" w:line="283" w:lineRule="auto"/>
+              <w:jc w:val="center"/>
             </w:pPr>
-            <w:r/>
             <w:r>
               <w:rPr>
-                <w:rFonts w:ascii="Malgun Gothic" w:hAnsi="Malgun Gothic" w:eastAsia="Malgun Gothic" w:cs="Malgun Gothic"/>
-                <w:b w:val="0"/>
-                <w:sz w:val="17"/>
+                <w:rFonts w:ascii="맑은 고딕" w:hAnsi="맑은 고딕" w:eastAsia="맑은 고딕" w:cs="맑은 고딕"/>
+                <w:b/>
+                <w:sz w:val="18"/>
               </w:rPr>
-              <w:t>tools/eval_affected_precision.py</w:t>
+              <w:t>시험 항목명</w:t>
             </w:r>
           </w:p>
         </w:tc>
         <w:tc>
           <w:tcPr>
-            <w:tcW w:type="dxa" w:w="7030"/>
+            <w:tcW w:type="dxa" w:w="8100"/>
+            <w:vAlign w:val="center"/>
           </w:tcPr>
           <w:p>
             <w:pPr>
-              <w:spacing w:before="0" w:after="40" w:line="240" w:lineRule="auto"/>
+              <w:spacing w:after="40" w:before="0" w:line="283" w:lineRule="auto"/>
             </w:pPr>
-            <w:r/>
             <w:r>
               <w:rPr>
-                <w:rFonts w:ascii="Malgun Gothic" w:hAnsi="Malgun Gothic" w:eastAsia="Malgun Gothic" w:cs="Malgun Gothic"/>
+                <w:rFonts w:ascii="맑은 고딕" w:hAnsi="맑은 고딕" w:eastAsia="맑은 고딕" w:cs="맑은 고딕"/>
                 <w:b w:val="0"/>
-                <w:sz w:val="17"/>
+                <w:sz w:val="18"/>
               </w:rPr>
-              <w:t>affected 자동분류에 대해 TP/FP를 집계하고 precision=TP/(TP+FP)×100 산출·기록(결정적 greedy 디코딩, 시드 고정). 결과는 results/affected_precision.json.</w:t>
+              <w:t>VEX 기반 식별된 취약점 영향 판단 정밀도</w:t>
             </w:r>
           </w:p>
         </w:tc>
@@ -143,291 +81,54 @@
       <w:tr>
         <w:tc>
           <w:tcPr>
-            <w:tcW w:type="dxa" w:w="2608"/>
+            <w:tcW w:type="dxa" w:w="1900"/>
+            <w:vAlign w:val="center"/>
+            <w:shd w:val="clear" w:color="auto" w:fill="D9E2F3"/>
           </w:tcPr>
           <w:p>
             <w:pPr>
-              <w:spacing w:before="0" w:after="40" w:line="240" w:lineRule="auto"/>
+              <w:spacing w:after="40" w:before="0" w:line="283" w:lineRule="auto"/>
+              <w:jc w:val="center"/>
             </w:pPr>
-            <w:r/>
             <w:r>
               <w:rPr>
-                <w:rFonts w:ascii="Malgun Gothic" w:hAnsi="Malgun Gothic" w:eastAsia="Malgun Gothic" w:cs="Malgun Gothic"/>
-                <w:b w:val="0"/>
-                <w:sz w:val="17"/>
+                <w:rFonts w:ascii="맑은 고딕" w:hAnsi="맑은 고딕" w:eastAsia="맑은 고딕" w:cs="맑은 고딕"/>
+                <w:b/>
+                <w:sz w:val="18"/>
               </w:rPr>
-              <w:t>평가 대상 모델</w:t>
+              <w:t>시험 목적</w:t>
             </w:r>
           </w:p>
         </w:tc>
         <w:tc>
           <w:tcPr>
-            <w:tcW w:type="dxa" w:w="7030"/>
+            <w:tcW w:type="dxa" w:w="8100"/>
+            <w:vAlign w:val="center"/>
           </w:tcPr>
           <w:p>
             <w:pPr>
-              <w:spacing w:before="0" w:after="40" w:line="240" w:lineRule="auto"/>
+              <w:spacing w:after="40" w:before="0" w:line="283" w:lineRule="auto"/>
             </w:pPr>
-            <w:r/>
             <w:r>
               <w:rPr>
-                <w:rFonts w:ascii="Malgun Gothic" w:hAnsi="Malgun Gothic" w:eastAsia="Malgun Gothic" w:cs="Malgun Gothic"/>
+                <w:rFonts w:ascii="맑은 고딕" w:hAnsi="맑은 고딕" w:eastAsia="맑은 고딕" w:cs="맑은 고딕"/>
                 <w:b w:val="0"/>
-                <w:sz w:val="17"/>
+                <w:sz w:val="18"/>
               </w:rPr>
-              <w:t>취약 코드 존재 판단 모델(sLLM): Qwen2.5-Coder-7B-Instruct + QLoRA(models/vex-justifier-lora/, commit 2f729d03).</w:t>
+              <w:t>산업제어시스템(ICS) 자산에 대해 VEX 필드에 ‘영향 있음(Affected)’으로 자동 분류된 항목 중, 실제로도 영향을 받는 것으로 확인된 항목의 비율(정밀도)을 측정한다.</w:t>
             </w:r>
           </w:p>
-        </w:tc>
-      </w:tr>
-    </w:tbl>
-    <w:p>
-      <w:pPr>
-        <w:spacing w:before="0" w:after="40" w:line="240" w:lineRule="auto"/>
-      </w:pPr>
-      <w:r>
-        <w:rPr>
-          <w:rFonts w:ascii="Malgun Gothic" w:hAnsi="Malgun Gothic" w:eastAsia="Malgun Gothic" w:cs="Malgun Gothic"/>
-          <w:b w:val="0"/>
-          <w:sz w:val="18"/>
-        </w:rPr>
-        <w:t>· TP: affected로 분류했고 정답(취약 버전=미패치)에서도 영향받음.  · FP: affected로 분류했으나 정답(패치/안전)에서 영향 없음.</w:t>
-      </w:r>
-    </w:p>
-    <w:p>
-      <w:pPr>
-        <w:spacing w:before="0" w:after="40" w:line="240" w:lineRule="auto"/>
-      </w:pPr>
-      <w:r>
-        <w:rPr>
-          <w:rFonts w:ascii="Malgun Gothic" w:hAnsi="Malgun Gothic" w:eastAsia="Malgun Gothic" w:cs="Malgun Gothic"/>
-          <w:b w:val="0"/>
-          <w:sz w:val="18"/>
-        </w:rPr>
-        <w:t>· 파싱 불가·not_affected는 분모(TP+FP)에서 제외. 재현율·F1은 합격 판정 대상이 아니다.</w:t>
-      </w:r>
-    </w:p>
-    <w:p>
-      <w:pPr>
-        <w:spacing w:before="80" w:after="40" w:line="240" w:lineRule="auto"/>
-      </w:pPr>
-      <w:r>
-        <w:rPr>
-          <w:rFonts w:ascii="Malgun Gothic" w:hAnsi="Malgun Gothic" w:eastAsia="Malgun Gothic" w:cs="Malgun Gothic"/>
-          <w:b/>
-          <w:color w:val="1F4E79"/>
-          <w:sz w:val="21"/>
-        </w:rPr>
-        <w:t>2. 시험 절차</w:t>
-      </w:r>
-    </w:p>
-    <w:p>
-      <w:pPr>
-        <w:spacing w:before="0" w:after="40" w:line="240" w:lineRule="auto"/>
-      </w:pPr>
-      <w:r>
-        <w:rPr>
-          <w:rFonts w:ascii="Malgun Gothic" w:hAnsi="Malgun Gothic" w:eastAsia="Malgun Gothic" w:cs="Malgun Gothic"/>
-          <w:b w:val="0"/>
-          <w:sz w:val="18"/>
-        </w:rPr>
-        <w:t>① 전제조건(제3항) 충족 확인 → ② 아래 명령 실행 → ③ 표준출력·결과 JSON 수집 → ④ precision 산출 → ⑤ ≥95% 이면 합격(PASS).</w:t>
-      </w:r>
-    </w:p>
-    <w:p>
-      <w:pPr>
-        <w:spacing w:before="20" w:after="60" w:line="240" w:lineRule="auto"/>
-        <w:ind w:left="170"/>
-        <w:shd w:val="clear" w:color="auto" w:fill="F2F2F2"/>
-      </w:pPr>
-      <w:r>
-        <w:rPr>
-          <w:rFonts w:ascii="Consolas" w:hAnsi="Consolas" w:eastAsia="Consolas" w:cs="Consolas"/>
-          <w:sz w:val="17"/>
-        </w:rPr>
-        <w:t>POC_BASE_MODEL="Qwen/Qwen2.5-Coder-7B-Instruct" SEED=20260416 SUBSAMPLE=12000 \</w:t>
-      </w:r>
-      <w:r>
-        <w:br/>
-      </w:r>
-      <w:r>
-        <w:rPr>
-          <w:rFonts w:ascii="Consolas" w:hAnsi="Consolas" w:eastAsia="Consolas" w:cs="Consolas"/>
-          <w:sz w:val="17"/>
-        </w:rPr>
-        <w:t xml:space="preserve">  python tools/eval_affected_precision.py --clean --n 1200</w:t>
-      </w:r>
-    </w:p>
-    <w:p>
-      <w:pPr>
-        <w:spacing w:before="0" w:after="40" w:line="240" w:lineRule="auto"/>
-      </w:pPr>
-      <w:r>
-        <w:rPr>
-          <w:rFonts w:ascii="Malgun Gothic" w:hAnsi="Malgun Gothic" w:eastAsia="Malgun Gothic" w:cs="Malgun Gothic"/>
-          <w:b w:val="0"/>
-          <w:sz w:val="18"/>
-        </w:rPr>
-        <w:t>· --clean: fix-commit 뒷받침 패치쌍 정답만 사용.  · --n: 평가 표본 수(전수 평가는 --n 3471).</w:t>
-      </w:r>
-    </w:p>
-    <w:p>
-      <w:pPr>
-        <w:spacing w:before="0" w:after="40" w:line="240" w:lineRule="auto"/>
-      </w:pPr>
-      <w:r>
-        <w:rPr>
-          <w:rFonts w:ascii="Malgun Gothic" w:hAnsi="Malgun Gothic" w:eastAsia="Malgun Gothic" w:cs="Malgun Gothic"/>
-          <w:b w:val="0"/>
-          <w:sz w:val="18"/>
-        </w:rPr>
-        <w:t>· (옵션) --abstain: 5회 샘플 만장일치일 때만 affected 발행, 애매하면 보류 → 정밀도 보강.</w:t>
-      </w:r>
-    </w:p>
-    <w:p>
-      <w:pPr>
-        <w:spacing w:before="80" w:after="40" w:line="240" w:lineRule="auto"/>
-      </w:pPr>
-      <w:r>
-        <w:rPr>
-          <w:rFonts w:ascii="Malgun Gothic" w:hAnsi="Malgun Gothic" w:eastAsia="Malgun Gothic" w:cs="Malgun Gothic"/>
-          <w:b/>
-          <w:color w:val="1F4E79"/>
-          <w:sz w:val="21"/>
-        </w:rPr>
-        <w:t>3. 시험을 위한 전제조건</w:t>
-      </w:r>
-    </w:p>
-    <w:p>
-      <w:pPr>
-        <w:spacing w:before="0" w:after="40" w:line="240" w:lineRule="auto"/>
-      </w:pPr>
-      <w:r>
-        <w:rPr>
-          <w:rFonts w:ascii="Malgun Gothic" w:hAnsi="Malgun Gothic" w:eastAsia="Malgun Gothic" w:cs="Malgun Gothic"/>
-          <w:b w:val="0"/>
-          <w:sz w:val="18"/>
-        </w:rPr>
-        <w:t>① 학습된 QLoRA 어댑터(models/vex-justifier-lora/) 존재 — 본 시험은 추론만 수행(재학습 없음).</w:t>
-      </w:r>
-    </w:p>
-    <w:p>
-      <w:pPr>
-        <w:spacing w:before="0" w:after="40" w:line="240" w:lineRule="auto"/>
-      </w:pPr>
-      <w:r>
-        <w:rPr>
-          <w:rFonts w:ascii="Malgun Gothic" w:hAnsi="Malgun Gothic" w:eastAsia="Malgun Gothic" w:cs="Malgun Gothic"/>
-          <w:b w:val="0"/>
-          <w:sz w:val="18"/>
-        </w:rPr>
-        <w:t>② 데이터 누출 방지: 평가는 학습에 쓰이지 않은 held-out 행만 사용. 학습·평가가 동일 셔플 시드(SEED=20260416)와 동일 학습 표본 크기(SUBSAMPLE=12000)를 써 학습 rows[:12000]과 평가 rows[12000:]이 서로소임을 보장.</w:t>
-      </w:r>
-    </w:p>
-    <w:p>
-      <w:pPr>
-        <w:spacing w:before="0" w:after="40" w:line="240" w:lineRule="auto"/>
-      </w:pPr>
-      <w:r>
-        <w:rPr>
-          <w:rFonts w:ascii="Malgun Gothic" w:hAnsi="Malgun Gothic" w:eastAsia="Malgun Gothic" w:cs="Malgun Gothic"/>
-          <w:b w:val="0"/>
-          <w:sz w:val="18"/>
-        </w:rPr>
-        <w:t>③ 결정성: greedy 디코딩(do_sample=False) + 표본추출 시드 고정(random.Random(7)) → 동일 입력에 동일 결과.</w:t>
-      </w:r>
-    </w:p>
-    <w:p>
-      <w:pPr>
-        <w:spacing w:before="0" w:after="40" w:line="240" w:lineRule="auto"/>
-      </w:pPr>
-      <w:r>
-        <w:rPr>
-          <w:rFonts w:ascii="Malgun Gothic" w:hAnsi="Malgun Gothic" w:eastAsia="Malgun Gothic" w:cs="Malgun Gothic"/>
-          <w:b w:val="0"/>
-          <w:sz w:val="18"/>
-        </w:rPr>
-        <w:t>④ 데이터셋 data/vex_train_full.jsonl이 제4항 형상(행 수·출처·클래스 분포)과 일치.</w:t>
-      </w:r>
-    </w:p>
-    <w:p>
-      <w:pPr>
-        <w:spacing w:before="80" w:after="40" w:line="240" w:lineRule="auto"/>
-      </w:pPr>
-      <w:r>
-        <w:rPr>
-          <w:rFonts w:ascii="Malgun Gothic" w:hAnsi="Malgun Gothic" w:eastAsia="Malgun Gothic" w:cs="Malgun Gothic"/>
-          <w:b/>
-          <w:color w:val="1F4E79"/>
-          <w:sz w:val="21"/>
-        </w:rPr>
-        <w:t>4. 성능평가결과 검증을 위한 데이터셋</w:t>
-      </w:r>
-    </w:p>
-    <w:p>
-      <w:pPr>
-        <w:spacing w:before="0" w:after="40" w:line="240" w:lineRule="auto"/>
-      </w:pPr>
-      <w:r>
-        <w:rPr>
-          <w:rFonts w:ascii="Malgun Gothic" w:hAnsi="Malgun Gothic" w:eastAsia="Malgun Gothic" w:cs="Malgun Gothic"/>
-          <w:b w:val="0"/>
-          <w:sz w:val="18"/>
-        </w:rPr>
-        <w:t>정답(그라운드 트루스)은 fix-commit(패치 커밋)으로 뒷받침되는 취약/패치 코드 쌍 — 취약 버전 함수→affected, 패치 버전 함수→not_affected. 시험 기준의 TP 정의('소스코드 패치 여부가 CVE 영향 조건과 일치')에 직접 부합.</w:t>
-      </w:r>
-    </w:p>
-    <w:tbl>
-      <w:tblPr>
-        <w:tblStyle w:val="TableGrid"/>
-        <w:tblW w:type="auto" w:w="0"/>
-        <w:jc w:val="center"/>
-        <w:tblLook w:firstColumn="1" w:firstRow="1" w:lastColumn="0" w:lastRow="0" w:noHBand="0" w:noVBand="1" w:val="04A0"/>
-      </w:tblPr>
-      <w:tblGrid>
-        <w:gridCol w:w="5100"/>
-        <w:gridCol w:w="5100"/>
-      </w:tblGrid>
-      <w:tr>
-        <w:tc>
-          <w:tcPr>
-            <w:tcW w:type="dxa" w:w="1814"/>
-            <w:shd w:val="clear" w:color="auto" w:fill="1F4E79"/>
-          </w:tcPr>
           <w:p>
             <w:pPr>
-              <w:spacing w:before="0" w:after="40" w:line="240" w:lineRule="auto"/>
+              <w:spacing w:after="40" w:before="0" w:line="283" w:lineRule="auto"/>
             </w:pPr>
-            <w:r/>
             <w:r>
               <w:rPr>
-                <w:rFonts w:ascii="Malgun Gothic" w:hAnsi="Malgun Gothic" w:eastAsia="Malgun Gothic" w:cs="Malgun Gothic"/>
-                <w:b/>
-                <w:color w:val="FFFFFF"/>
-                <w:sz w:val="17"/>
+                <w:rFonts w:ascii="맑은 고딕" w:hAnsi="맑은 고딕" w:eastAsia="맑은 고딕" w:cs="맑은 고딕"/>
+                <w:b w:val="0"/>
+                <w:sz w:val="18"/>
               </w:rPr>
-              <w:t>구분</w:t>
-            </w:r>
-          </w:p>
-        </w:tc>
-        <w:tc>
-          <w:tcPr>
-            <w:tcW w:type="dxa" w:w="7824"/>
-            <w:shd w:val="clear" w:color="auto" w:fill="1F4E79"/>
-          </w:tcPr>
-          <w:p>
-            <w:pPr>
-              <w:spacing w:before="0" w:after="40" w:line="240" w:lineRule="auto"/>
-            </w:pPr>
-            <w:r/>
-            <w:r>
-              <w:rPr>
-                <w:rFonts w:ascii="Malgun Gothic" w:hAnsi="Malgun Gothic" w:eastAsia="Malgun Gothic" w:cs="Malgun Gothic"/>
-                <w:b/>
-                <w:color w:val="FFFFFF"/>
-                <w:sz w:val="17"/>
-              </w:rPr>
-              <w:t>값</w:t>
+              <w:t>SBOM의 정보를 취약점 데이터와 매칭시켜 영향 여부를 자동으로 판단하고(CISA 4대 저스티피케이션 질문 중 Q1: 취약 코드 존재 여부), 그 판단의 정확성(정밀도)을 측정한다.</w:t>
             </w:r>
           </w:p>
         </w:tc>
@@ -435,39 +136,83 @@
       <w:tr>
         <w:tc>
           <w:tcPr>
-            <w:tcW w:type="dxa" w:w="1814"/>
+            <w:tcW w:type="dxa" w:w="1900"/>
+            <w:vAlign w:val="center"/>
+            <w:shd w:val="clear" w:color="auto" w:fill="D9E2F3"/>
           </w:tcPr>
           <w:p>
             <w:pPr>
-              <w:spacing w:before="0" w:after="40" w:line="240" w:lineRule="auto"/>
+              <w:spacing w:after="40" w:before="0" w:line="283" w:lineRule="auto"/>
+              <w:jc w:val="center"/>
             </w:pPr>
-            <w:r/>
             <w:r>
               <w:rPr>
-                <w:rFonts w:ascii="Malgun Gothic" w:hAnsi="Malgun Gothic" w:eastAsia="Malgun Gothic" w:cs="Malgun Gothic"/>
-                <w:b w:val="0"/>
-                <w:sz w:val="17"/>
+                <w:rFonts w:ascii="맑은 고딕" w:hAnsi="맑은 고딕" w:eastAsia="맑은 고딕" w:cs="맑은 고딕"/>
+                <w:b/>
+                <w:sz w:val="18"/>
               </w:rPr>
-              <w:t>평가 표본</w:t>
+              <w:t>시험 기준</w:t>
             </w:r>
           </w:p>
         </w:tc>
         <w:tc>
           <w:tcPr>
-            <w:tcW w:type="dxa" w:w="7824"/>
+            <w:tcW w:type="dxa" w:w="8100"/>
+            <w:vAlign w:val="center"/>
           </w:tcPr>
           <w:p>
             <w:pPr>
-              <w:spacing w:before="0" w:after="40" w:line="240" w:lineRule="auto"/>
+              <w:spacing w:after="40" w:before="0" w:line="283" w:lineRule="auto"/>
             </w:pPr>
-            <w:r/>
             <w:r>
               <w:rPr>
-                <w:rFonts w:ascii="Malgun Gothic" w:hAnsi="Malgun Gothic" w:eastAsia="Malgun Gothic" w:cs="Malgun Gothic"/>
+                <w:rFonts w:ascii="맑은 고딕" w:hAnsi="맑은 고딕" w:eastAsia="맑은 고딕" w:cs="맑은 고딕"/>
+                <w:b/>
+                <w:sz w:val="18"/>
+              </w:rPr>
+              <w:t>정밀도 = 실제 영향 있는 CVE 수(TP) ÷ 자동 분류된 영향 있는 CVE 수(TP + FP) × 100</w:t>
+            </w:r>
+          </w:p>
+          <w:p>
+            <w:pPr>
+              <w:spacing w:after="40" w:before="0" w:line="283" w:lineRule="auto"/>
+              <w:ind w:left="200" w:hanging="200"/>
+            </w:pPr>
+            <w:r>
+              <w:rPr>
+                <w:rFonts w:ascii="맑은 고딕" w:hAnsi="맑은 고딕" w:eastAsia="맑은 고딕" w:cs="맑은 고딕"/>
                 <w:b w:val="0"/>
-                <w:sz w:val="17"/>
+                <w:sz w:val="18"/>
               </w:rPr>
-              <w:t>data/vex_train_full.jsonl의 held-out(rows[12000:]) 중 패치쌍 출처만(--clean)</w:t>
+              <w:t>· TP(True Positive): SBOM 버전·소스코드 패치 여부·실행 컨텍스트가 CVE 영향 조건과 일치하는 사례. 정답 근거는 취약 버전의 소스코드가 존재하고 해당 취약 코드가 패치로 제거되지 않은 상태(= 취약 버전과 일치)이다.</w:t>
+            </w:r>
+          </w:p>
+          <w:p>
+            <w:pPr>
+              <w:spacing w:after="40" w:before="0" w:line="283" w:lineRule="auto"/>
+              <w:ind w:left="200" w:hanging="200"/>
+            </w:pPr>
+            <w:r>
+              <w:rPr>
+                <w:rFonts w:ascii="맑은 고딕" w:hAnsi="맑은 고딕" w:eastAsia="맑은 고딕" w:cs="맑은 고딕"/>
+                <w:b w:val="0"/>
+                <w:sz w:val="18"/>
+              </w:rPr>
+              <w:t>· FP(False Positive): 자동 판별 기준을 충족했으나 실제로는 영향 없음(= 패치된/안전한 코드)으로 확인된 사례.</w:t>
+            </w:r>
+          </w:p>
+          <w:p>
+            <w:pPr>
+              <w:spacing w:after="40" w:before="0" w:line="283" w:lineRule="auto"/>
+              <w:ind w:left="200" w:hanging="200"/>
+            </w:pPr>
+            <w:r>
+              <w:rPr>
+                <w:rFonts w:ascii="맑은 고딕" w:hAnsi="맑은 고딕" w:eastAsia="맑은 고딕" w:cs="맑은 고딕"/>
+                <w:b w:val="0"/>
+                <w:sz w:val="18"/>
+              </w:rPr>
+              <w:t>· 파싱 불가·not_affected·보류(abstain)는 분모(TP + FP)에서 제외한다. 본 지표는 정밀도 단독 평가이며 재현율(Recall)·F1은 합격 판정 대상이 아니다.</w:t>
             </w:r>
           </w:p>
         </w:tc>
@@ -475,39 +220,98 @@
       <w:tr>
         <w:tc>
           <w:tcPr>
-            <w:tcW w:type="dxa" w:w="1814"/>
+            <w:tcW w:type="dxa" w:w="1900"/>
+            <w:vAlign w:val="center"/>
+            <w:shd w:val="clear" w:color="auto" w:fill="D9E2F3"/>
           </w:tcPr>
           <w:p>
             <w:pPr>
-              <w:spacing w:before="0" w:after="40" w:line="240" w:lineRule="auto"/>
+              <w:spacing w:after="40" w:before="0" w:line="283" w:lineRule="auto"/>
+              <w:jc w:val="center"/>
             </w:pPr>
-            <w:r/>
             <w:r>
               <w:rPr>
-                <w:rFonts w:ascii="Malgun Gothic" w:hAnsi="Malgun Gothic" w:eastAsia="Malgun Gothic" w:cs="Malgun Gothic"/>
-                <w:b w:val="0"/>
-                <w:sz w:val="17"/>
+                <w:rFonts w:ascii="맑은 고딕" w:hAnsi="맑은 고딕" w:eastAsia="맑은 고딕" w:cs="맑은 고딕"/>
+                <w:b/>
+                <w:sz w:val="18"/>
               </w:rPr>
-              <w:t>규모</w:t>
+              <w:t>전제 조건</w:t>
             </w:r>
           </w:p>
         </w:tc>
         <w:tc>
           <w:tcPr>
-            <w:tcW w:type="dxa" w:w="7824"/>
+            <w:tcW w:type="dxa" w:w="8100"/>
+            <w:vAlign w:val="center"/>
           </w:tcPr>
           <w:p>
             <w:pPr>
-              <w:spacing w:before="0" w:after="40" w:line="240" w:lineRule="auto"/>
+              <w:spacing w:after="40" w:before="0" w:line="283" w:lineRule="auto"/>
+              <w:ind w:left="200" w:hanging="200"/>
             </w:pPr>
-            <w:r/>
             <w:r>
               <w:rPr>
-                <w:rFonts w:ascii="Malgun Gothic" w:hAnsi="Malgun Gothic" w:eastAsia="Malgun Gothic" w:cs="Malgun Gothic"/>
+                <w:rFonts w:ascii="맑은 고딕" w:hAnsi="맑은 고딕" w:eastAsia="맑은 고딕" w:cs="맑은 고딕"/>
                 <w:b w:val="0"/>
-                <w:sz w:val="17"/>
+                <w:sz w:val="18"/>
               </w:rPr>
-              <w:t>held-out ∩ 패치쌍 = 3,471행 (affected 2,124 / not_affected 1,347)</w:t>
+              <w:t>① 학습된 QLoRA 어댑터(models/vex-justifier-lora/)가 존재한다. 본 시험은 추론만 수행하며 재학습하지 않는다.</w:t>
+            </w:r>
+          </w:p>
+          <w:p>
+            <w:pPr>
+              <w:spacing w:after="40" w:before="0" w:line="283" w:lineRule="auto"/>
+              <w:ind w:left="200" w:hanging="200"/>
+            </w:pPr>
+            <w:r>
+              <w:rPr>
+                <w:rFonts w:ascii="맑은 고딕" w:hAnsi="맑은 고딕" w:eastAsia="맑은 고딕" w:cs="맑은 고딕"/>
+                <w:b w:val="0"/>
+                <w:sz w:val="18"/>
+              </w:rPr>
+              <w:t>② 데이터 누출 방지: 평가는 학습에 사용되지 않은 held-out 행만 사용한다. 학습·평가가 동일 셔플 시드(SEED=20260416)와 동일 학습 표본 크기(SUBSAMPLE=12000)를 사용하여 학습 rows[:12000]과 평가 rows[12000:]이 서로소임을 보장한다.</w:t>
+            </w:r>
+          </w:p>
+          <w:p>
+            <w:pPr>
+              <w:spacing w:after="40" w:before="0" w:line="283" w:lineRule="auto"/>
+              <w:ind w:left="200" w:hanging="200"/>
+            </w:pPr>
+            <w:r>
+              <w:rPr>
+                <w:rFonts w:ascii="맑은 고딕" w:hAnsi="맑은 고딕" w:eastAsia="맑은 고딕" w:cs="맑은 고딕"/>
+                <w:b w:val="0"/>
+                <w:sz w:val="18"/>
+              </w:rPr>
+              <w:t>③ 결정성: 시험 도구는 greedy 디코딩(do_sample=False)과 고정 표본추출 시드(random.Random(7))로 동작하여 동일 입력에 대해 동일 결과를 산출한다.</w:t>
+            </w:r>
+          </w:p>
+          <w:p>
+            <w:pPr>
+              <w:spacing w:after="40" w:before="0" w:line="283" w:lineRule="auto"/>
+              <w:ind w:left="200" w:hanging="200"/>
+            </w:pPr>
+            <w:r>
+              <w:rPr>
+                <w:rFonts w:ascii="맑은 고딕" w:hAnsi="맑은 고딕" w:eastAsia="맑은 고딕" w:cs="맑은 고딕"/>
+                <w:b w:val="0"/>
+                <w:sz w:val="18"/>
+              </w:rPr>
+              <w:t>④ 데이터셋 data/vex_train_full.jsonl이 아래 ‘시험 도구’의 형상(행 수·출처·클래스 분포)과 일치한다.</w:t>
+            </w:r>
+          </w:p>
+          <w:p>
+            <w:pPr>
+              <w:spacing w:after="40" w:before="0" w:line="283" w:lineRule="auto"/>
+              <w:ind w:left="200" w:hanging="200"/>
+            </w:pPr>
+            <w:r>
+              <w:rPr>
+                <w:rFonts w:ascii="맑은 고딕" w:hAnsi="맑은 고딕" w:eastAsia="맑은 고딕" w:cs="맑은 고딕"/>
+                <w:b w:val="0"/>
+                <w:sz w:val="18"/>
+              </w:rPr>
+              <w:t>⑤ 시험 환경: NVIDIA RTX 4070 Ti SUPER(16GB), Python 3.10, PyTorch 2.11+cu128, transformers 5.15, peft 0.20, bitsandbytes 0.50, 베이스 모델 Qwen2.5-Coder-7B-Instruct(4-bit NF4 로드).</w:t>
             </w:r>
           </w:p>
         </w:tc>
@@ -515,39 +319,70 @@
       <w:tr>
         <w:tc>
           <w:tcPr>
-            <w:tcW w:type="dxa" w:w="1814"/>
+            <w:tcW w:type="dxa" w:w="1900"/>
+            <w:vAlign w:val="center"/>
+            <w:shd w:val="clear" w:color="auto" w:fill="D9E2F3"/>
           </w:tcPr>
           <w:p>
             <w:pPr>
-              <w:spacing w:before="0" w:after="40" w:line="240" w:lineRule="auto"/>
+              <w:spacing w:after="40" w:before="0" w:line="283" w:lineRule="auto"/>
+              <w:jc w:val="center"/>
             </w:pPr>
-            <w:r/>
             <w:r>
               <w:rPr>
-                <w:rFonts w:ascii="Malgun Gothic" w:hAnsi="Malgun Gothic" w:eastAsia="Malgun Gothic" w:cs="Malgun Gothic"/>
-                <w:b w:val="0"/>
-                <w:sz w:val="17"/>
+                <w:rFonts w:ascii="맑은 고딕" w:hAnsi="맑은 고딕" w:eastAsia="맑은 고딕" w:cs="맑은 고딕"/>
+                <w:b/>
+                <w:sz w:val="18"/>
               </w:rPr>
-              <w:t>출처</w:t>
+              <w:t>시험 도구</w:t>
             </w:r>
           </w:p>
         </w:tc>
         <w:tc>
           <w:tcPr>
-            <w:tcW w:type="dxa" w:w="7824"/>
+            <w:tcW w:type="dxa" w:w="8100"/>
+            <w:vAlign w:val="center"/>
           </w:tcPr>
           <w:p>
             <w:pPr>
-              <w:spacing w:before="0" w:after="40" w:line="240" w:lineRule="auto"/>
+              <w:spacing w:after="40" w:before="0" w:line="283" w:lineRule="auto"/>
+              <w:ind w:left="200" w:hanging="200"/>
             </w:pPr>
-            <w:r/>
             <w:r>
               <w:rPr>
-                <w:rFonts w:ascii="Malgun Gothic" w:hAnsi="Malgun Gothic" w:eastAsia="Malgun Gothic" w:cs="Malgun Gothic"/>
+                <w:rFonts w:ascii="맑은 고딕" w:hAnsi="맑은 고딕" w:eastAsia="맑은 고딕" w:cs="맑은 고딕"/>
                 <w:b w:val="0"/>
-                <w:sz w:val="17"/>
+                <w:sz w:val="18"/>
               </w:rPr>
-              <w:t>CVEfixes(PROMISE'21) 2,119 · BigVul(MSR'20) 1,352 · project seed 소수</w:t>
+              <w:t>· tools/eval_affected_precision.py — 본 시험 전용 정밀도 측정 도구. affected 분류에 대해 TP/FP를 집계하고 precision = TP/(TP+FP)×100을 산출·기록한다. 결과는 results/affected_precision.json에 저장된다.</w:t>
+            </w:r>
+          </w:p>
+          <w:p>
+            <w:pPr>
+              <w:spacing w:after="40" w:before="0" w:line="283" w:lineRule="auto"/>
+              <w:ind w:left="200" w:hanging="200"/>
+            </w:pPr>
+            <w:r>
+              <w:rPr>
+                <w:rFonts w:ascii="맑은 고딕" w:hAnsi="맑은 고딕" w:eastAsia="맑은 고딕" w:cs="맑은 고딕"/>
+                <w:b w:val="0"/>
+                <w:sz w:val="18"/>
+              </w:rPr>
+              <w:t>· 평가 대상 모델 — 취약 코드 존재 판단 모델(sLLM): Qwen2.5-Coder-7B-Instruct + QLoRA 어댑터(models/vex-justifier-lora/).</w:t>
+            </w:r>
+          </w:p>
+          <w:p>
+            <w:pPr>
+              <w:spacing w:after="40" w:before="0" w:line="283" w:lineRule="auto"/>
+              <w:ind w:left="200" w:hanging="200"/>
+            </w:pPr>
+            <w:r>
+              <w:rPr>
+                <w:rFonts w:ascii="맑은 고딕" w:hAnsi="맑은 고딕" w:eastAsia="맑은 고딕" w:cs="맑은 고딕"/>
+                <w:b w:val="0"/>
+                <w:sz w:val="18"/>
+              </w:rPr>
+              <w:t>· 검증 데이터셋 — data/vex_train_full.jsonl의 held-out(rows[12000:]) ∩ fix-commit 패치쌍(--clean): 3,471행(affected 2,124 / not_affected 1,347), 출처 CVEfixes 2,119·BigVul 1,352·project seed 소수. 취약 버전 함수→affected, 패치 버전 함수→not_affected.</w:t>
             </w:r>
           </w:p>
         </w:tc>
@@ -555,60 +390,244 @@
       <w:tr>
         <w:tc>
           <w:tcPr>
-            <w:tcW w:type="dxa" w:w="1814"/>
+            <w:tcW w:type="dxa" w:w="1900"/>
+            <w:vAlign w:val="center"/>
+            <w:shd w:val="clear" w:color="auto" w:fill="D9E2F3"/>
           </w:tcPr>
           <w:p>
             <w:pPr>
-              <w:spacing w:before="0" w:after="40" w:line="240" w:lineRule="auto"/>
+              <w:spacing w:after="40" w:before="0" w:line="283" w:lineRule="auto"/>
+              <w:jc w:val="center"/>
             </w:pPr>
-            <w:r/>
             <w:r>
               <w:rPr>
-                <w:rFonts w:ascii="Malgun Gothic" w:hAnsi="Malgun Gothic" w:eastAsia="Malgun Gothic" w:cs="Malgun Gothic"/>
-                <w:b w:val="0"/>
-                <w:sz w:val="17"/>
+                <w:rFonts w:ascii="맑은 고딕" w:hAnsi="맑은 고딕" w:eastAsia="맑은 고딕" w:cs="맑은 고딕"/>
+                <w:b/>
+                <w:sz w:val="18"/>
               </w:rPr>
-              <w:t>누출 없음</w:t>
+              <w:t>시험 절차</w:t>
             </w:r>
           </w:p>
         </w:tc>
         <w:tc>
           <w:tcPr>
-            <w:tcW w:type="dxa" w:w="7824"/>
+            <w:tcW w:type="dxa" w:w="8100"/>
+            <w:vAlign w:val="center"/>
           </w:tcPr>
           <w:p>
             <w:pPr>
-              <w:spacing w:before="0" w:after="40" w:line="240" w:lineRule="auto"/>
+              <w:spacing w:after="40" w:before="0" w:line="283" w:lineRule="auto"/>
+              <w:ind w:left="200" w:hanging="200"/>
             </w:pPr>
-            <w:r/>
             <w:r>
               <w:rPr>
-                <w:rFonts w:ascii="Malgun Gothic" w:hAnsi="Malgun Gothic" w:eastAsia="Malgun Gothic" w:cs="Malgun Gothic"/>
+                <w:rFonts w:ascii="맑은 고딕" w:hAnsi="맑은 고딕" w:eastAsia="맑은 고딕" w:cs="맑은 고딕"/>
                 <w:b w:val="0"/>
-                <w:sz w:val="17"/>
+                <w:sz w:val="18"/>
               </w:rPr>
-              <w:t>정답은 학습 표본과 서로소인 held-out에서만 취함. 모델 입력(함수 코드)과 분리된 필드로 사후 대조(모델에 정답 미제공)</w:t>
+              <w:t>① 전제조건(어댑터 존재·데이터셋 형상·시드)의 충족을 확인한다.</w:t>
+            </w:r>
+          </w:p>
+          <w:p>
+            <w:pPr>
+              <w:spacing w:after="40" w:before="0" w:line="283" w:lineRule="auto"/>
+              <w:ind w:left="200" w:hanging="200"/>
+            </w:pPr>
+            <w:r>
+              <w:rPr>
+                <w:rFonts w:ascii="맑은 고딕" w:hAnsi="맑은 고딕" w:eastAsia="맑은 고딕" w:cs="맑은 고딕"/>
+                <w:b w:val="0"/>
+                <w:sz w:val="18"/>
+              </w:rPr>
+              <w:t>② 아래 명령을 실행한다.</w:t>
+            </w:r>
+          </w:p>
+          <w:p>
+            <w:pPr>
+              <w:spacing w:after="40" w:before="0" w:line="283" w:lineRule="auto"/>
+            </w:pPr>
+            <w:r>
+              <w:rPr>
+                <w:rFonts w:ascii="Consolas" w:hAnsi="Consolas" w:eastAsia="Consolas" w:cs="Consolas"/>
+                <w:b w:val="0"/>
+                <w:sz w:val="16"/>
+              </w:rPr>
+              <w:t>POC_BASE_MODEL="Qwen/Qwen2.5-Coder-7B-Instruct" SEED=20260416 SUBSAMPLE=12000 python tools/eval_affected_precision.py --clean --n 1200</w:t>
+            </w:r>
+          </w:p>
+          <w:p>
+            <w:pPr>
+              <w:spacing w:after="40" w:before="0" w:line="283" w:lineRule="auto"/>
+            </w:pPr>
+            <w:r>
+              <w:rPr>
+                <w:rFonts w:ascii="맑은 고딕" w:hAnsi="맑은 고딕" w:eastAsia="맑은 고딕" w:cs="맑은 고딕"/>
+                <w:b w:val="0"/>
+                <w:sz w:val="18"/>
+              </w:rPr>
+              <w:t xml:space="preserve">   (--clean: fix-commit 뒷받침 패치쌍만 사용 / --n: 평가 표본 수, 전수 평가는 --n 3471 / 옵션 --abstain: 5회 샘플 만장일치일 때만 affected 발행하여 정밀도 보강)</w:t>
+            </w:r>
+          </w:p>
+          <w:p>
+            <w:pPr>
+              <w:spacing w:after="40" w:before="0" w:line="283" w:lineRule="auto"/>
+              <w:ind w:left="200" w:hanging="200"/>
+            </w:pPr>
+            <w:r>
+              <w:rPr>
+                <w:rFonts w:ascii="맑은 고딕" w:hAnsi="맑은 고딕" w:eastAsia="맑은 고딕" w:cs="맑은 고딕"/>
+                <w:b w:val="0"/>
+                <w:sz w:val="18"/>
+              </w:rPr>
+              <w:t>③ 표준출력의 진행 로그·최종 요약과 결과 JSON(results/affected_precision.json)을 수집한다.</w:t>
+            </w:r>
+          </w:p>
+          <w:p>
+            <w:pPr>
+              <w:spacing w:after="40" w:before="0" w:line="283" w:lineRule="auto"/>
+              <w:ind w:left="200" w:hanging="200"/>
+            </w:pPr>
+            <w:r>
+              <w:rPr>
+                <w:rFonts w:ascii="맑은 고딕" w:hAnsi="맑은 고딕" w:eastAsia="맑은 고딕" w:cs="맑은 고딕"/>
+                <w:b w:val="0"/>
+                <w:sz w:val="18"/>
+              </w:rPr>
+              <w:t>④ precision = TP/(TP+FP)×100을 산출한다.</w:t>
+            </w:r>
+          </w:p>
+          <w:p>
+            <w:pPr>
+              <w:spacing w:after="40" w:before="0" w:line="283" w:lineRule="auto"/>
+              <w:ind w:left="200" w:hanging="200"/>
+            </w:pPr>
+            <w:r>
+              <w:rPr>
+                <w:rFonts w:ascii="맑은 고딕" w:hAnsi="맑은 고딕" w:eastAsia="맑은 고딕" w:cs="맑은 고딕"/>
+                <w:b/>
+                <w:sz w:val="18"/>
+              </w:rPr>
+              <w:t>⑤ precision ≥ 85.0%이면 합격(PASS), 미만이면 불합격(FAIL)으로 판정한다.</w:t>
+            </w:r>
+          </w:p>
+        </w:tc>
+      </w:tr>
+      <w:tr>
+        <w:tc>
+          <w:tcPr>
+            <w:tcW w:type="dxa" w:w="1900"/>
+            <w:vAlign w:val="center"/>
+            <w:shd w:val="clear" w:color="auto" w:fill="D9E2F3"/>
+          </w:tcPr>
+          <w:p>
+            <w:pPr>
+              <w:spacing w:after="40" w:before="0" w:line="283" w:lineRule="auto"/>
+              <w:jc w:val="center"/>
+            </w:pPr>
+            <w:r>
+              <w:rPr>
+                <w:rFonts w:ascii="맑은 고딕" w:hAnsi="맑은 고딕" w:eastAsia="맑은 고딕" w:cs="맑은 고딕"/>
+                <w:b/>
+                <w:sz w:val="18"/>
+              </w:rPr>
+              <w:t>시험 예상 결과</w:t>
+            </w:r>
+          </w:p>
+        </w:tc>
+        <w:tc>
+          <w:tcPr>
+            <w:tcW w:type="dxa" w:w="8100"/>
+            <w:vAlign w:val="center"/>
+          </w:tcPr>
+          <w:p>
+            <w:pPr>
+              <w:spacing w:after="40" w:before="0" w:line="283" w:lineRule="auto"/>
+            </w:pPr>
+            <w:r>
+              <w:rPr>
+                <w:rFonts w:ascii="맑은 고딕" w:hAnsi="맑은 고딕" w:eastAsia="맑은 고딕" w:cs="맑은 고딕"/>
+                <w:b/>
+                <w:sz w:val="18"/>
+              </w:rPr>
+              <w:t>VEX 기반 식별된 취약점 영향 판단 정밀도 85% 이상</w:t>
+            </w:r>
+          </w:p>
+          <w:p>
+            <w:pPr>
+              <w:spacing w:after="40" w:before="0" w:line="283" w:lineRule="auto"/>
+            </w:pPr>
+            <w:r>
+              <w:rPr>
+                <w:rFonts w:ascii="맑은 고딕" w:hAnsi="맑은 고딕" w:eastAsia="맑은 고딕" w:cs="맑은 고딕"/>
+                <w:b w:val="0"/>
+                <w:sz w:val="18"/>
+              </w:rPr>
+              <w:t>(자체시험 참고: held-out 패치쌍 n=1,200, affected 분류 452건 중 TP 449 / FP 3 → 정밀도 99.34%, PASS)</w:t>
+            </w:r>
+          </w:p>
+        </w:tc>
+      </w:tr>
+      <w:tr>
+        <w:tc>
+          <w:tcPr>
+            <w:tcW w:type="dxa" w:w="1900"/>
+            <w:vAlign w:val="center"/>
+            <w:shd w:val="clear" w:color="auto" w:fill="D9E2F3"/>
+          </w:tcPr>
+          <w:p>
+            <w:pPr>
+              <w:spacing w:after="40" w:before="0" w:line="283" w:lineRule="auto"/>
+              <w:jc w:val="center"/>
+            </w:pPr>
+            <w:r>
+              <w:rPr>
+                <w:rFonts w:ascii="맑은 고딕" w:hAnsi="맑은 고딕" w:eastAsia="맑은 고딕" w:cs="맑은 고딕"/>
+                <w:b/>
+                <w:sz w:val="18"/>
+              </w:rPr>
+              <w:t>기타 사항</w:t>
+            </w:r>
+          </w:p>
+        </w:tc>
+        <w:tc>
+          <w:tcPr>
+            <w:tcW w:type="dxa" w:w="8100"/>
+            <w:vAlign w:val="center"/>
+          </w:tcPr>
+          <w:p>
+            <w:pPr>
+              <w:spacing w:after="40" w:before="0" w:line="283" w:lineRule="auto"/>
+              <w:ind w:left="200" w:hanging="200"/>
+            </w:pPr>
+            <w:r>
+              <w:rPr>
+                <w:rFonts w:ascii="맑은 고딕" w:hAnsi="맑은 고딕" w:eastAsia="맑은 고딕" w:cs="맑은 고딕"/>
+                <w:b w:val="0"/>
+                <w:sz w:val="18"/>
+              </w:rPr>
+              <w:t>· 형상 추적성: 평가 대상 어댑터·검증 데이터셋·시험 스크립트는 git commit으로 식별하며, 결정적 디코딩과 고정 시드로 재현성을 보장한다.</w:t>
+            </w:r>
+          </w:p>
+          <w:p>
+            <w:pPr>
+              <w:spacing w:after="40" w:before="0" w:line="283" w:lineRule="auto"/>
+              <w:ind w:left="200" w:hanging="200"/>
+            </w:pPr>
+            <w:r>
+              <w:rPr>
+                <w:rFonts w:ascii="맑은 고딕" w:hAnsi="맑은 고딕" w:eastAsia="맑은 고딕" w:cs="맑은 고딕"/>
+                <w:b w:val="0"/>
+                <w:sz w:val="18"/>
+              </w:rPr>
+              <w:t>· 정답의 독립성: 정답 라벨은 공개 취약점 데이터셋(CVEfixes, BigVul)의 패치 커밋에서 유래하며, 모델 입력(함수 코드)과 분리된 필드(completion.status)로 사후 대조한다(모델에 정답을 제공하지 않는다).</w:t>
             </w:r>
           </w:p>
         </w:tc>
       </w:tr>
     </w:tbl>
-    <w:p>
-      <w:pPr>
-        <w:spacing w:before="0" w:after="40" w:line="240" w:lineRule="auto"/>
-      </w:pPr>
-      <w:r>
-        <w:rPr>
-          <w:rFonts w:ascii="Malgun Gothic" w:hAnsi="Malgun Gothic" w:eastAsia="Malgun Gothic" w:cs="Malgun Gothic"/>
-          <w:b w:val="0"/>
-          <w:sz w:val="16"/>
-        </w:rPr>
-        <w:t>※ 원 코드 표본은 각 출처 라이선스를 따름. 재구성 스크립트: tools/build_vexc_dataset.py, tools/collect_vulnfix_dataset.py.</w:t>
-      </w:r>
-    </w:p>
     <w:sectPr>
       <w:pgSz w:w="12240" w:h="15840"/>
-      <w:pgMar w:top="907" w:right="1020" w:bottom="907" w:left="1020" w:header="720" w:footer="720" w:gutter="0"/>
+      <w:pgMar w:top="1000" w:right="1100" w:bottom="1000" w:left="1100" w:header="720" w:footer="720" w:gutter="0"/>
       <w:cols w:space="720"/>
       <w:docGrid w:linePitch="360"/>
     </w:sectPr>
@@ -979,10 +998,6 @@
     <w:name w:val="Normal"/>
     <w:qFormat/>
     <w:rsid w:val="00FC693F"/>
-    <w:rPr>
-      <w:rFonts w:ascii="Malgun Gothic" w:hAnsi="Malgun Gothic" w:eastAsia="Malgun Gothic"/>
-      <w:sz w:val="18"/>
-    </w:rPr>
   </w:style>
   <w:style w:type="paragraph" w:styleId="Header">
     <w:name w:val="header"/>

</xml_diff>